<commit_message>
Methods: Prot 707 gains the reagent fast path; 701 latency corrected
reagents_watch.sh now polls the repo head every minute round the clock and
runs the sync the moment a website Save lands, so the master workbook is
rewritten within ~a minute instead of up to 15 (or overnight, for a save made
after 8pm). 707 documents it plus the two traps found building it: the watcher
must not take the sync's own lock, and cron's bare PATH does not contain gh.

Co-Authored-By: Claude Opus 5 <noreply@anthropic.com>
Claude-Session: https://claude.ai/code/session_01Sbw76zJAHkSir3muetg8sY
</commit_message>
<xml_diff>
--- a/internal/methods_files/Prot_707_The_Reagent_Inventory_and_its_Two_Way_Sync.docx
+++ b/internal/methods_files/Prot_707_The_Reagent_Inventory_and_its_Two_Way_Sync.docx
@@ -45,7 +45,33 @@
         <w:ind w:left="720" w:hanging="360"/>
       </w:pPr>
       <w:r>
-        <w:t xml:space="preserve">The Reagents page and /fh/fast/yeh_a/grp/reagents/My Lab.xlsx are two views of ONE dataset. Edit either. A job reconciles them every 15 minutes, 7am to 8pm.</w:t>
+        <w:t xml:space="preserve">The Reagents page and /fh/fast/yeh_a/grp/reagents/My Lab.xlsx are two views of ONE dataset. Edit either; they are reconciled both ways.</w:t>
+      </w:r>
+    </w:p>
+    <w:p>
+      <w:pPr>
+        <w:numPr>
+          <w:ilvl w:val="0"/>
+          <w:numId w:val="1"/>
+        </w:numPr>
+        <w:spacing w:after="40"/>
+        <w:ind w:left="720" w:hanging="360"/>
+      </w:pPr>
+      <w:r>
+        <w:t xml:space="preserve">WEBSITE -&gt; EXCEL is near-immediate. reagents_watch.sh runs every minute, round the clock, and compares the repository head against the local checkout. A no-op costs one API call and about 0.4 seconds; a Save triggers the full sync, so the workbook is physically rewritten within about a minute.</w:t>
+      </w:r>
+    </w:p>
+    <w:p>
+      <w:pPr>
+        <w:numPr>
+          <w:ilvl w:val="0"/>
+          <w:numId w:val="1"/>
+        </w:numPr>
+        <w:spacing w:after="40"/>
+        <w:ind w:left="720" w:hanging="360"/>
+      </w:pPr>
+      <w:r>
+        <w:t xml:space="preserve">EXCEL -&gt; WEBSITE is the 15-minute sweep, :07/:22/:37/:52, 7am to 8pm. It has to stay: an edit typed into Excel produces no commit, so there is no event for the fast path to notice. Only the periodic pass can carry a spreadsheet edit out to the website.</w:t>
       </w:r>
     </w:p>
     <w:p>
@@ -353,6 +379,57 @@
       </w:pPr>
       <w:r>
         <w:t xml:space="preserve">./run_reagents_sync.sh — the real thing: pulls, syncs, writes the workbook (backing it up first), publishes, and touches the heartbeat.</w:t>
+      </w:r>
+    </w:p>
+    <w:p>
+      <w:pPr>
+        <w:numPr>
+          <w:ilvl w:val="0"/>
+          <w:numId w:val="2"/>
+        </w:numPr>
+        <w:spacing w:after="40"/>
+        <w:ind w:left="720" w:hanging="360"/>
+      </w:pPr>
+      <w:r>
+        <w:t xml:space="preserve">./reagents_watch.sh — the fast path. Cheap to run by hand; it does nothing unless the repository head has moved.</w:t>
+      </w:r>
+    </w:p>
+    <w:p>
+      <w:pPr>
+        <w:pStyle w:val="Heading2"/>
+        <w:spacing w:before="240" w:after="80"/>
+      </w:pPr>
+      <w:r>
+        <w:rPr>
+          <w:b/>
+        </w:rPr>
+        <w:t xml:space="preserve">Two traps in the fast path, both hit while building it:</w:t>
+      </w:r>
+    </w:p>
+    <w:p>
+      <w:pPr>
+        <w:numPr>
+          <w:ilvl w:val="0"/>
+          <w:numId w:val="1"/>
+        </w:numPr>
+        <w:spacing w:after="40"/>
+        <w:ind w:left="720" w:hanging="360"/>
+      </w:pPr>
+      <w:r>
+        <w:t xml:space="preserve">The watcher must NOT take the sync lock itself. An early version did, and the sync it then invoked as a CHILD found the lock held and exited without working — the watcher had locked out the very job it exists to trigger. Serialisation belongs only in the script that writes the workbook.</w:t>
+      </w:r>
+    </w:p>
+    <w:p>
+      <w:pPr>
+        <w:numPr>
+          <w:ilvl w:val="0"/>
+          <w:numId w:val="1"/>
+        </w:numPr>
+        <w:spacing w:after="40"/>
+        <w:ind w:left="720" w:hanging="360"/>
+      </w:pPr>
+      <w:r>
+        <w:t xml:space="preserve">cron runs with a bare PATH of /usr/bin:/bin, and gh lives in /app/bin. The first cron fire died on exactly that. Resolve external commands by absolute path in anything cron runs, and test with env -i PATH=/usr/bin:/bin rather than from your own shell.</w:t>
       </w:r>
     </w:p>
     <w:p>

</xml_diff>